<commit_message>
Add Locust test reports and update Assessment Engine anomalies report
</commit_message>
<xml_diff>
--- a/Assessment_Engine_Anomalies_Report.docx
+++ b/Assessment_Engine_Anomalies_Report.docx
@@ -582,6 +582,78 @@
           </w:p>
         </w:tc>
       </w:tr>
+      <w:tr>
+        <w:tc>
+          <w:tcPr>
+            <w:tcW w:type="dxa" w:w="2880"/>
+          </w:tcPr>
+          <w:p>
+            <w:r>
+              <w:t>A-09</w:t>
+            </w:r>
+          </w:p>
+        </w:tc>
+        <w:tc>
+          <w:tcPr>
+            <w:tcW w:type="dxa" w:w="2880"/>
+          </w:tcPr>
+          <w:p>
+            <w:r>
+              <w:t>SQLite Database Write Lock Contention under concurrency</w:t>
+            </w:r>
+          </w:p>
+        </w:tc>
+        <w:tc>
+          <w:tcPr>
+            <w:tcW w:type="dxa" w:w="2880"/>
+          </w:tcPr>
+          <w:p>
+            <w:r>
+              <w:rPr>
+                <w:b/>
+                <w:color w:val="990000"/>
+              </w:rPr>
+              <w:t>Critical</w:t>
+            </w:r>
+          </w:p>
+        </w:tc>
+      </w:tr>
+      <w:tr>
+        <w:tc>
+          <w:tcPr>
+            <w:tcW w:type="dxa" w:w="2880"/>
+          </w:tcPr>
+          <w:p>
+            <w:r>
+              <w:t>A-10</w:t>
+            </w:r>
+          </w:p>
+        </w:tc>
+        <w:tc>
+          <w:tcPr>
+            <w:tcW w:type="dxa" w:w="2880"/>
+          </w:tcPr>
+          <w:p>
+            <w:r>
+              <w:t>Grade 6 and Grade 10 Curriculum Gap Failures</w:t>
+            </w:r>
+          </w:p>
+        </w:tc>
+        <w:tc>
+          <w:tcPr>
+            <w:tcW w:type="dxa" w:w="2880"/>
+          </w:tcPr>
+          <w:p>
+            <w:r>
+              <w:rPr>
+                <w:b/>
+                <w:color w:val="CC6600"/>
+              </w:rPr>
+              <w:t>High</w:t>
+            </w:r>
+          </w:p>
+        </w:tc>
+      </w:tr>
     </w:tbl>
     <w:p>
       <w:r>
@@ -979,6 +1051,650 @@
         <w:br/>
       </w:r>
     </w:p>
+    <w:p>
+      <w:r>
+        <w:br w:type="page"/>
+      </w:r>
+    </w:p>
+    <w:p>
+      <w:pPr>
+        <w:pStyle w:val="Heading1"/>
+      </w:pPr>
+      <w:r>
+        <w:rPr>
+          <w:color w:val="003366"/>
+        </w:rPr>
+        <w:t>Section 3: Load Testing &amp; Performance Anomalies (Locust Run)</w:t>
+      </w:r>
+    </w:p>
+    <w:p>
+      <w:r>
+        <w:t>A local load test was executed using the provided Locust load testing configuration to evaluate the system's performance, stability, and concurrency handling. The test simulated realistic student journeys including session initialization, sequential response submissions, and final diagnostic report generation.</w:t>
+      </w:r>
+    </w:p>
+    <w:p>
+      <w:pPr>
+        <w:pStyle w:val="Heading2"/>
+      </w:pPr>
+      <w:r>
+        <w:rPr>
+          <w:color w:val="006699"/>
+        </w:rPr>
+        <w:t>3.1 Load Test Parameters</w:t>
+      </w:r>
+    </w:p>
+    <w:p>
+      <w:r>
+        <w:rPr>
+          <w:b/>
+        </w:rPr>
+        <w:t xml:space="preserve">• </w:t>
+      </w:r>
+      <w:r>
+        <w:t>Simulated Users (Concurrency): 30 concurrent users</w:t>
+        <w:br/>
+      </w:r>
+      <w:r>
+        <w:rPr>
+          <w:b/>
+        </w:rPr>
+        <w:t xml:space="preserve">• </w:t>
+      </w:r>
+      <w:r>
+        <w:t>Spawn Rate: 5 users/second</w:t>
+        <w:br/>
+      </w:r>
+      <w:r>
+        <w:rPr>
+          <w:b/>
+        </w:rPr>
+        <w:t xml:space="preserve">• </w:t>
+      </w:r>
+      <w:r>
+        <w:t>Duration: 1 minute (60 seconds)</w:t>
+        <w:br/>
+      </w:r>
+      <w:r>
+        <w:rPr>
+          <w:b/>
+        </w:rPr>
+        <w:t xml:space="preserve">• </w:t>
+      </w:r>
+      <w:r>
+        <w:t>Target Environment: Local Docker containers (symphony-frontend-local proxying to symphony-backend-local)</w:t>
+        <w:br/>
+      </w:r>
+      <w:r>
+        <w:rPr>
+          <w:b/>
+        </w:rPr>
+        <w:t xml:space="preserve">• </w:t>
+      </w:r>
+      <w:r>
+        <w:t>Database: Local SQLite file (test.db) inside the backend container</w:t>
+      </w:r>
+    </w:p>
+    <w:p>
+      <w:pPr>
+        <w:pStyle w:val="Heading2"/>
+      </w:pPr>
+      <w:r>
+        <w:rPr>
+          <w:color w:val="006699"/>
+        </w:rPr>
+        <w:t>3.2 Aggregated Performance Metrics</w:t>
+      </w:r>
+    </w:p>
+    <w:tbl>
+      <w:tblPr>
+        <w:tblStyle w:val="TableGrid"/>
+        <w:tblW w:type="auto" w:w="0"/>
+        <w:tblLook w:firstColumn="1" w:firstRow="1" w:lastColumn="0" w:lastRow="0" w:noHBand="0" w:noVBand="1" w:val="04A0"/>
+      </w:tblPr>
+      <w:tblGrid>
+        <w:gridCol w:w="1080"/>
+        <w:gridCol w:w="1080"/>
+        <w:gridCol w:w="1080"/>
+        <w:gridCol w:w="1080"/>
+        <w:gridCol w:w="1080"/>
+        <w:gridCol w:w="1080"/>
+        <w:gridCol w:w="1080"/>
+        <w:gridCol w:w="1080"/>
+      </w:tblGrid>
+      <w:tr>
+        <w:tc>
+          <w:tcPr>
+            <w:tcW w:type="dxa" w:w="1080"/>
+          </w:tcPr>
+          <w:p>
+            <w:r>
+              <w:rPr>
+                <w:b/>
+              </w:rPr>
+              <w:t>Method</w:t>
+            </w:r>
+          </w:p>
+        </w:tc>
+        <w:tc>
+          <w:tcPr>
+            <w:tcW w:type="dxa" w:w="1080"/>
+          </w:tcPr>
+          <w:p>
+            <w:r>
+              <w:rPr>
+                <w:b/>
+              </w:rPr>
+              <w:t>Name / Endpoint</w:t>
+            </w:r>
+          </w:p>
+        </w:tc>
+        <w:tc>
+          <w:tcPr>
+            <w:tcW w:type="dxa" w:w="1080"/>
+          </w:tcPr>
+          <w:p>
+            <w:r>
+              <w:rPr>
+                <w:b/>
+              </w:rPr>
+              <w:t>Requests</w:t>
+            </w:r>
+          </w:p>
+        </w:tc>
+        <w:tc>
+          <w:tcPr>
+            <w:tcW w:type="dxa" w:w="1080"/>
+          </w:tcPr>
+          <w:p>
+            <w:r>
+              <w:rPr>
+                <w:b/>
+              </w:rPr>
+              <w:t>Failures</w:t>
+            </w:r>
+          </w:p>
+        </w:tc>
+        <w:tc>
+          <w:tcPr>
+            <w:tcW w:type="dxa" w:w="1080"/>
+          </w:tcPr>
+          <w:p>
+            <w:r>
+              <w:rPr>
+                <w:b/>
+              </w:rPr>
+              <w:t>Failure %</w:t>
+            </w:r>
+          </w:p>
+        </w:tc>
+        <w:tc>
+          <w:tcPr>
+            <w:tcW w:type="dxa" w:w="1080"/>
+          </w:tcPr>
+          <w:p>
+            <w:r>
+              <w:rPr>
+                <w:b/>
+              </w:rPr>
+              <w:t>Avg RT (ms)</w:t>
+            </w:r>
+          </w:p>
+        </w:tc>
+        <w:tc>
+          <w:tcPr>
+            <w:tcW w:type="dxa" w:w="1080"/>
+          </w:tcPr>
+          <w:p>
+            <w:r>
+              <w:rPr>
+                <w:b/>
+              </w:rPr>
+              <w:t>Max RT (ms)</w:t>
+            </w:r>
+          </w:p>
+        </w:tc>
+        <w:tc>
+          <w:tcPr>
+            <w:tcW w:type="dxa" w:w="1080"/>
+          </w:tcPr>
+          <w:p>
+            <w:r>
+              <w:rPr>
+                <w:b/>
+              </w:rPr>
+              <w:t>Reqs/sec</w:t>
+            </w:r>
+          </w:p>
+        </w:tc>
+      </w:tr>
+      <w:tr>
+        <w:tc>
+          <w:tcPr>
+            <w:tcW w:type="dxa" w:w="1080"/>
+          </w:tcPr>
+          <w:p>
+            <w:r>
+              <w:t>POST</w:t>
+            </w:r>
+          </w:p>
+        </w:tc>
+        <w:tc>
+          <w:tcPr>
+            <w:tcW w:type="dxa" w:w="1080"/>
+          </w:tcPr>
+          <w:p>
+            <w:r>
+              <w:t>/api/session/start</w:t>
+            </w:r>
+          </w:p>
+        </w:tc>
+        <w:tc>
+          <w:tcPr>
+            <w:tcW w:type="dxa" w:w="1080"/>
+          </w:tcPr>
+          <w:p>
+            <w:r>
+              <w:t>306</w:t>
+            </w:r>
+          </w:p>
+        </w:tc>
+        <w:tc>
+          <w:tcPr>
+            <w:tcW w:type="dxa" w:w="1080"/>
+          </w:tcPr>
+          <w:p>
+            <w:r>
+              <w:t>114</w:t>
+            </w:r>
+          </w:p>
+        </w:tc>
+        <w:tc>
+          <w:tcPr>
+            <w:tcW w:type="dxa" w:w="1080"/>
+          </w:tcPr>
+          <w:p>
+            <w:r>
+              <w:t>37.25%</w:t>
+            </w:r>
+          </w:p>
+        </w:tc>
+        <w:tc>
+          <w:tcPr>
+            <w:tcW w:type="dxa" w:w="1080"/>
+          </w:tcPr>
+          <w:p>
+            <w:r>
+              <w:t>399</w:t>
+            </w:r>
+          </w:p>
+        </w:tc>
+        <w:tc>
+          <w:tcPr>
+            <w:tcW w:type="dxa" w:w="1080"/>
+          </w:tcPr>
+          <w:p>
+            <w:r>
+              <w:t>4,334</w:t>
+            </w:r>
+          </w:p>
+        </w:tc>
+        <w:tc>
+          <w:tcPr>
+            <w:tcW w:type="dxa" w:w="1080"/>
+          </w:tcPr>
+          <w:p>
+            <w:r>
+              <w:t>5.11</w:t>
+            </w:r>
+          </w:p>
+        </w:tc>
+      </w:tr>
+      <w:tr>
+        <w:tc>
+          <w:tcPr>
+            <w:tcW w:type="dxa" w:w="1080"/>
+          </w:tcPr>
+          <w:p>
+            <w:r>
+              <w:t>POST</w:t>
+            </w:r>
+          </w:p>
+        </w:tc>
+        <w:tc>
+          <w:tcPr>
+            <w:tcW w:type="dxa" w:w="1080"/>
+          </w:tcPr>
+          <w:p>
+            <w:r>
+              <w:t>/api/session/respond</w:t>
+            </w:r>
+          </w:p>
+        </w:tc>
+        <w:tc>
+          <w:tcPr>
+            <w:tcW w:type="dxa" w:w="1080"/>
+          </w:tcPr>
+          <w:p>
+            <w:r>
+              <w:t>1614</w:t>
+            </w:r>
+          </w:p>
+        </w:tc>
+        <w:tc>
+          <w:tcPr>
+            <w:tcW w:type="dxa" w:w="1080"/>
+          </w:tcPr>
+          <w:p>
+            <w:r>
+              <w:t>91</w:t>
+            </w:r>
+          </w:p>
+        </w:tc>
+        <w:tc>
+          <w:tcPr>
+            <w:tcW w:type="dxa" w:w="1080"/>
+          </w:tcPr>
+          <w:p>
+            <w:r>
+              <w:t>5.64%</w:t>
+            </w:r>
+          </w:p>
+        </w:tc>
+        <w:tc>
+          <w:tcPr>
+            <w:tcW w:type="dxa" w:w="1080"/>
+          </w:tcPr>
+          <w:p>
+            <w:r>
+              <w:t>552</w:t>
+            </w:r>
+          </w:p>
+        </w:tc>
+        <w:tc>
+          <w:tcPr>
+            <w:tcW w:type="dxa" w:w="1080"/>
+          </w:tcPr>
+          <w:p>
+            <w:r>
+              <w:t>5,489</w:t>
+            </w:r>
+          </w:p>
+        </w:tc>
+        <w:tc>
+          <w:tcPr>
+            <w:tcW w:type="dxa" w:w="1080"/>
+          </w:tcPr>
+          <w:p>
+            <w:r>
+              <w:t>26.94</w:t>
+            </w:r>
+          </w:p>
+        </w:tc>
+      </w:tr>
+      <w:tr>
+        <w:tc>
+          <w:tcPr>
+            <w:tcW w:type="dxa" w:w="1080"/>
+          </w:tcPr>
+          <w:p>
+            <w:r>
+              <w:rPr>
+                <w:b/>
+              </w:rPr>
+              <w:t>-</w:t>
+            </w:r>
+          </w:p>
+        </w:tc>
+        <w:tc>
+          <w:tcPr>
+            <w:tcW w:type="dxa" w:w="1080"/>
+          </w:tcPr>
+          <w:p>
+            <w:r>
+              <w:rPr>
+                <w:b/>
+              </w:rPr>
+              <w:t>Aggregated Total</w:t>
+            </w:r>
+          </w:p>
+        </w:tc>
+        <w:tc>
+          <w:tcPr>
+            <w:tcW w:type="dxa" w:w="1080"/>
+          </w:tcPr>
+          <w:p>
+            <w:r>
+              <w:rPr>
+                <w:b/>
+              </w:rPr>
+              <w:t>2,110</w:t>
+            </w:r>
+          </w:p>
+        </w:tc>
+        <w:tc>
+          <w:tcPr>
+            <w:tcW w:type="dxa" w:w="1080"/>
+          </w:tcPr>
+          <w:p>
+            <w:r>
+              <w:rPr>
+                <w:b/>
+              </w:rPr>
+              <w:t>235</w:t>
+            </w:r>
+          </w:p>
+        </w:tc>
+        <w:tc>
+          <w:tcPr>
+            <w:tcW w:type="dxa" w:w="1080"/>
+          </w:tcPr>
+          <w:p>
+            <w:r>
+              <w:rPr>
+                <w:b/>
+              </w:rPr>
+              <w:t>11.14%</w:t>
+            </w:r>
+          </w:p>
+        </w:tc>
+        <w:tc>
+          <w:tcPr>
+            <w:tcW w:type="dxa" w:w="1080"/>
+          </w:tcPr>
+          <w:p>
+            <w:r>
+              <w:rPr>
+                <w:b/>
+              </w:rPr>
+              <w:t>524</w:t>
+            </w:r>
+          </w:p>
+        </w:tc>
+        <w:tc>
+          <w:tcPr>
+            <w:tcW w:type="dxa" w:w="1080"/>
+          </w:tcPr>
+          <w:p>
+            <w:r>
+              <w:rPr>
+                <w:b/>
+              </w:rPr>
+              <w:t>5,489</w:t>
+            </w:r>
+          </w:p>
+        </w:tc>
+        <w:tc>
+          <w:tcPr>
+            <w:tcW w:type="dxa" w:w="1080"/>
+          </w:tcPr>
+          <w:p>
+            <w:r>
+              <w:rPr>
+                <w:b/>
+              </w:rPr>
+              <w:t>35.22</w:t>
+            </w:r>
+          </w:p>
+        </w:tc>
+      </w:tr>
+    </w:tbl>
+    <w:p>
+      <w:r>
+        <w:br/>
+        <w:t>*Note: High average and max response times (up to 5.48 seconds) were observed due to database write blocks, and a significant portion of failures are attributed to logical anomalies under load.</w:t>
+      </w:r>
+    </w:p>
+    <w:p>
+      <w:pPr>
+        <w:pStyle w:val="Heading2"/>
+      </w:pPr>
+      <w:r>
+        <w:rPr>
+          <w:color w:val="006699"/>
+        </w:rPr>
+        <w:t>3.3 Newly Identified Load-Testing Anomalies</w:t>
+      </w:r>
+    </w:p>
+    <w:p>
+      <w:r>
+        <w:rPr>
+          <w:b/>
+          <w:color w:val="990000"/>
+        </w:rPr>
+        <w:t>Anomaly A-09: SQLite Database Write Lock Contention (Critical)</w:t>
+      </w:r>
+    </w:p>
+    <w:p>
+      <w:r>
+        <w:rPr>
+          <w:b/>
+        </w:rPr>
+        <w:t>Issue:</w:t>
+        <w:br/>
+      </w:r>
+      <w:r>
+        <w:t>Under concurrent write loads, the system experiences database file lock contentions. This causes SQL queries to timeout, raising 'sqlite3.OperationalError: database is locked' and throwing 500 Internal Server Errors back to the student clients.</w:t>
+      </w:r>
+    </w:p>
+    <w:p>
+      <w:r>
+        <w:rPr>
+          <w:b/>
+        </w:rPr>
+        <w:t>Example:</w:t>
+        <w:br/>
+      </w:r>
+      <w:r>
+        <w:t>During the 1-minute load test, 91 response submissions (POST /api/session/respond) and 26 session starts failed with a 500 error. The server log tracebacks show:</w:t>
+        <w:br/>
+      </w:r>
+      <w:r>
+        <w:rPr>
+          <w:i/>
+        </w:rPr>
+        <w:t xml:space="preserve">  sqlite3.OperationalError: database is locked</w:t>
+        <w:br/>
+      </w:r>
+      <w:r>
+        <w:rPr>
+          <w:i/>
+        </w:rPr>
+        <w:t xml:space="preserve">  [SQL: INSERT INTO responses (...) VALUES (...)]</w:t>
+        <w:br/>
+      </w:r>
+      <w:r>
+        <w:t>This occurred because multiple async request threads attempted to perform write operations (inserting students, sessions, BKT states, and responses) on the same SQLite file simultaneously.</w:t>
+      </w:r>
+    </w:p>
+    <w:p>
+      <w:r>
+        <w:rPr>
+          <w:b/>
+        </w:rPr>
+        <w:t>Core Cause:</w:t>
+        <w:br/>
+      </w:r>
+      <w:r>
+        <w:t>SQLite is a file-based database that locks the entire database file for writing during a transaction. It does not support concurrent writers. Since FastAPI serves requests concurrently using a threadpool, multiple concurrent HTTP write requests trigger database contention. While SQLite is suitable for single-user local development, it is completely unable to handle multi-user production load.</w:t>
+      </w:r>
+    </w:p>
+    <w:p>
+      <w:r>
+        <w:rPr>
+          <w:b/>
+        </w:rPr>
+        <w:t>Remediation:</w:t>
+        <w:br/>
+      </w:r>
+      <w:r>
+        <w:t>Migrate the database to a dedicated PostgreSQL database server (such as GCP Cloud SQL) as detailed in the deployment roadmap. PostgreSQL uses row-level locking, multiversion concurrency control (MVCC), and handles high concurrent read/write transactions seamlessly without locking operations.</w:t>
+      </w:r>
+    </w:p>
+    <w:p>
+      <w:r>
+        <w:rPr>
+          <w:b/>
+          <w:color w:val="CC6600"/>
+        </w:rPr>
+        <w:t>Anomaly A-10: Grade 6 and Grade 10 Curriculum Gap Failures (High)</w:t>
+      </w:r>
+    </w:p>
+    <w:p>
+      <w:r>
+        <w:rPr>
+          <w:b/>
+        </w:rPr>
+        <w:t>Issue:</w:t>
+        <w:br/>
+      </w:r>
+      <w:r>
+        <w:t>When a simulated student starts a session for Grade 6 or Grade 10, the session start endpoint fails, returning a 404 Not Found error with the detail 'No questions available for this grade'.</w:t>
+      </w:r>
+    </w:p>
+    <w:p>
+      <w:r>
+        <w:rPr>
+          <w:b/>
+        </w:rPr>
+        <w:t>Example:</w:t>
+        <w:br/>
+      </w:r>
+      <w:r>
+        <w:t xml:space="preserve">Out of 306 session starts, 88 failed with a 404 status. These failures matched exactly when the load generator randomly simulated a student of Grade 6 or Grade 10, returning: </w:t>
+      </w:r>
+      <w:r>
+        <w:rPr>
+          <w:i/>
+        </w:rPr>
+        <w:t>{"detail": "No questions available for this grade"}</w:t>
+      </w:r>
+    </w:p>
+    <w:p>
+      <w:r>
+        <w:rPr>
+          <w:b/>
+        </w:rPr>
+        <w:t>Core Cause:</w:t>
+        <w:br/>
+      </w:r>
+      <w:r>
+        <w:t>This load testing behavior is caused by Anomaly A-01 (documented in Section 2): the lack of curriculum skills/questions specifically loaded for Grades 6 and 10 in the question bank database, combined with the SQL range matching bug. Under load, this logical bug manifests as a high frequency of HTTP 404 errors, causing a 37.2% overall failure rate for the session start endpoint.</w:t>
+      </w:r>
+    </w:p>
+    <w:p>
+      <w:r>
+        <w:rPr>
+          <w:b/>
+        </w:rPr>
+        <w:t>Remediation:</w:t>
+        <w:br/>
+      </w:r>
+      <w:r>
+        <w:t>1. Import valid curriculum skills and questions for Grade 6 and Grade 10 into the database.</w:t>
+        <w:br/>
+        <w:t>2. Fix the _grade_filter range matching logic in app/engine/orchestrator.py to strip whitespace and properly parse slash-separated lists (e.g. by using JSON/array types or clean string matching).</w:t>
+      </w:r>
+    </w:p>
     <w:sectPr>
       <w:pgSz w:w="12240" w:h="15840"/>
       <w:pgMar w:top="1440" w:right="1800" w:bottom="1440" w:left="1800" w:header="720" w:footer="720" w:gutter="0"/>

</xml_diff>